<commit_message>
Update user manual for web machine/target selector + capture button
New detection section: pick a machine (its size target) from the Contour
Detection card on the web, plus the Capture + save-to-DB button. Refresh
overview screenshot and add 10_detection_web.png; rebuild the .docx.

Co-Authored-By: Claude Opus 4.8 (1M context) <noreply@anthropic.com>
</commit_message>
<xml_diff>
--- a/docs/USER_MANUAL.docx
+++ b/docs/USER_MANUAL.docx
@@ -410,7 +410,7 @@
         <w:pStyle w:val="Heading1"/>
       </w:pPr>
       <w:r>
-        <w:t>3. การตรวจจับ (Contour Detection)</w:t>
+        <w:t>3. การตรวจจับ (Contour Detection) - เลือกเครื่องจักรผ่านหน้าเว็บ</w:t>
       </w:r>
     </w:p>
     <w:p>
@@ -418,7 +418,46 @@
         <w:rPr>
           <w:b/>
         </w:rPr>
-        <w:t>ที่ Sidebar → CAMERA CONTROL (ต้องเปิดกล้องก่อน):</w:t>
+        <w:t>ทำได้บนหน้าเว็บทั้งหมด ไม่ต้องใช้โปรแกรม Desktop - ที่การ์ด Contour Detection ด้านขวา</w:t>
+      </w:r>
+    </w:p>
+    <w:p>
+      <w:pPr>
+        <w:jc w:val="center"/>
+      </w:pPr>
+      <w:r>
+        <w:drawing>
+          <wp:inline xmlns:a="http://schemas.openxmlformats.org/drawingml/2006/main" xmlns:pic="http://schemas.openxmlformats.org/drawingml/2006/picture">
+            <wp:extent cx="5760720" cy="3600450"/>
+            <wp:docPr id="4" name="Picture 4"/>
+            <wp:cNvGraphicFramePr>
+              <a:graphicFrameLocks noChangeAspect="1"/>
+            </wp:cNvGraphicFramePr>
+            <a:graphic>
+              <a:graphicData uri="http://schemas.openxmlformats.org/drawingml/2006/picture">
+                <pic:pic>
+                  <pic:nvPicPr>
+                    <pic:cNvPr id="0" name="10_detection_web.png"/>
+                    <pic:cNvPicPr/>
+                  </pic:nvPicPr>
+                  <pic:blipFill>
+                    <a:blip r:embed="rId12"/>
+                    <a:stretch>
+                      <a:fillRect/>
+                    </a:stretch>
+                  </pic:blipFill>
+                  <pic:spPr>
+                    <a:xfrm>
+                      <a:off x="0" y="0"/>
+                      <a:ext cx="5760720" cy="3600450"/>
+                    </a:xfrm>
+                    <a:prstGeom prst="rect"/>
+                  </pic:spPr>
+                </pic:pic>
+              </a:graphicData>
+            </a:graphic>
+          </wp:inline>
+        </w:drawing>
       </w:r>
     </w:p>
     <w:p>
@@ -426,7 +465,7 @@
         <w:pStyle w:val="ListNumber"/>
       </w:pPr>
       <w:r>
-        <w:t>กด "Start Contour" เพื่อเริ่มตรวจจับ contour (แยกวัตถุจากพื้นหลัง แล้วตีกรอบ ROI)</w:t>
+        <w:t>กด "Start Camera" (Sidebar) ให้ภาพขึ้นก่อน</w:t>
       </w:r>
     </w:p>
     <w:p>
@@ -434,7 +473,7 @@
         <w:pStyle w:val="ListNumber"/>
       </w:pPr>
       <w:r>
-        <w:t>ปุ่ม "ยางดำ / ยางขาว" — สลับชนิดวัสดุ (ยางดำ = พื้นขาว-วัตถุดำ, ยางขาว = พื้นดำ-วัตถุขาว) [กดได้เมื่อเปิดกล้อง + เปิด Contour แล้ว]</w:t>
+        <w:t>ที่การ์ด Contour Detection -&gt; ช่อง "Machine (Target)" -&gt; เลือกเครื่องจักร (แต่ละเครื่องมีขนาดเป้าหมายในตัว พอเลือกก็เริ่มตรวจจับทันที เช่น "CUTT Line A (600-1200 mm2)")</w:t>
       </w:r>
     </w:p>
     <w:p>
@@ -442,7 +481,15 @@
         <w:pStyle w:val="ListNumber"/>
       </w:pPr>
       <w:r>
-        <w:t>ปุ่ม "Multi: OFF/ON" — เปิดตรวจจับหลายวัตถุพร้อมกัน</w:t>
+        <w:t>เลือก "— ไม่เลือก / หยุดตรวจจับ —" = หยุดตรวจจับ</w:t>
+      </w:r>
+    </w:p>
+    <w:p>
+      <w:pPr>
+        <w:pStyle w:val="ListNumber"/>
+      </w:pPr>
+      <w:r>
+        <w:t>(เสริมที่ Sidebar) ปุ่ม "ยางดำ/ยางขาว" สลับชนิดวัสดุ, "Multi: ON" ตรวจหลายวัตถุ</w:t>
       </w:r>
     </w:p>
     <w:p>
@@ -450,7 +497,7 @@
         <w:rPr>
           <w:b/>
         </w:rPr>
-        <w:t>ผลลัพธ์แสดงที่แผงขวา (Contour Detection):</w:t>
+        <w:t>ผลลัพธ์ที่การ์ด Contour Detection:</w:t>
       </w:r>
     </w:p>
     <w:p>
@@ -458,7 +505,7 @@
         <w:pStyle w:val="ListBullet"/>
       </w:pPr>
       <w:r>
-        <w:t>เครื่องจักร / Configuration / LOT — การตั้งค่าที่กำลังใช้งาน</w:t>
+        <w:t>เครื่องจักร / Target Area / Tolerance - เป้าหมายที่ใช้ตัดสิน</w:t>
       </w:r>
     </w:p>
     <w:p>
@@ -466,7 +513,7 @@
         <w:pStyle w:val="ListBullet"/>
       </w:pPr>
       <w:r>
-        <w:t>Target Area / Tolerance — เกณฑ์ขนาดที่ยอมรับ</w:t>
+        <w:t>สถิติ: Total, Pass, Near, Fail</w:t>
       </w:r>
     </w:p>
     <w:p>
@@ -474,7 +521,7 @@
         <w:pStyle w:val="ListBullet"/>
       </w:pPr>
       <w:r>
-        <w:t>สถิติ 3 ระดับ: Total (ทั้งหมด), Pass (ผ่าน), Near (ใกล้เคียง), Fail (ไม่ผ่าน)</w:t>
+        <w:t>กรอบ ROI บนภาพสด: เขียว = ผ่าน, เหลือง = ใกล้เคียง, แดง = ไม่ผ่าน</w:t>
       </w:r>
     </w:p>
     <w:p>
@@ -482,7 +529,39 @@
         <w:rPr>
           <w:b w:val="0"/>
         </w:rPr>
-        <w:t>กรอบ ROI บนภาพสดแสดงสี: เขียว = ผ่าน, เหลือง = ใกล้เคียง, แดง = ไม่ผ่าน</w:t>
+        <w:t>หมายเหตุ: เครื่องจักรต้องตั้ง Area Config (min/max mm2) ก่อน ที่ Settings -&gt; Machines (ดูข้อ 6)</w:t>
+      </w:r>
+    </w:p>
+    <w:p>
+      <w:r>
+        <w:rPr>
+          <w:b/>
+        </w:rPr>
+        <w:t>ปุ่ม "ถ่าย + บันทึก DB":</w:t>
+      </w:r>
+    </w:p>
+    <w:p>
+      <w:pPr>
+        <w:pStyle w:val="ListBullet"/>
+      </w:pPr>
+      <w:r>
+        <w:t>อยู่ใต้ dropdown - ถ่ายภาพพร้อมกรอบ ROI แล้วบันทึกผลลงฐานข้อมูล</w:t>
+      </w:r>
+    </w:p>
+    <w:p>
+      <w:pPr>
+        <w:pStyle w:val="ListBullet"/>
+      </w:pPr>
+      <w:r>
+        <w:t>ใช้ได้เมื่อเลือกเครื่องจักรแล้ว (กำลังตรวจจับ)</w:t>
+      </w:r>
+    </w:p>
+    <w:p>
+      <w:pPr>
+        <w:pStyle w:val="ListBullet"/>
+      </w:pPr>
+      <w:r>
+        <w:t>ต้องเปิด Settings -&gt; Database -&gt; Enable Database Storage ก่อน ถึงจะบันทึกลง DB</w:t>
       </w:r>
     </w:p>
     <w:p>
@@ -509,7 +588,7 @@
         <w:drawing>
           <wp:inline xmlns:a="http://schemas.openxmlformats.org/drawingml/2006/main" xmlns:pic="http://schemas.openxmlformats.org/drawingml/2006/picture">
             <wp:extent cx="5760720" cy="3600450"/>
-            <wp:docPr id="4" name="Picture 4"/>
+            <wp:docPr id="5" name="Picture 5"/>
             <wp:cNvGraphicFramePr>
               <a:graphicFrameLocks noChangeAspect="1"/>
             </wp:cNvGraphicFramePr>
@@ -521,7 +600,7 @@
                     <pic:cNvPicPr/>
                   </pic:nvPicPr>
                   <pic:blipFill>
-                    <a:blip r:embed="rId12"/>
+                    <a:blip r:embed="rId13"/>
                     <a:stretch>
                       <a:fillRect/>
                     </a:stretch>
@@ -604,7 +683,7 @@
         <w:drawing>
           <wp:inline xmlns:a="http://schemas.openxmlformats.org/drawingml/2006/main" xmlns:pic="http://schemas.openxmlformats.org/drawingml/2006/picture">
             <wp:extent cx="5760720" cy="3600450"/>
-            <wp:docPr id="5" name="Picture 5"/>
+            <wp:docPr id="6" name="Picture 6"/>
             <wp:cNvGraphicFramePr>
               <a:graphicFrameLocks noChangeAspect="1"/>
             </wp:cNvGraphicFramePr>
@@ -616,7 +695,7 @@
                     <pic:cNvPicPr/>
                   </pic:nvPicPr>
                   <pic:blipFill>
-                    <a:blip r:embed="rId13"/>
+                    <a:blip r:embed="rId14"/>
                     <a:stretch>
                       <a:fillRect/>
                     </a:stretch>
@@ -699,7 +778,7 @@
         <w:drawing>
           <wp:inline xmlns:a="http://schemas.openxmlformats.org/drawingml/2006/main" xmlns:pic="http://schemas.openxmlformats.org/drawingml/2006/picture">
             <wp:extent cx="5760720" cy="3600450"/>
-            <wp:docPr id="6" name="Picture 6"/>
+            <wp:docPr id="7" name="Picture 7"/>
             <wp:cNvGraphicFramePr>
               <a:graphicFrameLocks noChangeAspect="1"/>
             </wp:cNvGraphicFramePr>
@@ -711,7 +790,7 @@
                     <pic:cNvPicPr/>
                   </pic:nvPicPr>
                   <pic:blipFill>
-                    <a:blip r:embed="rId14"/>
+                    <a:blip r:embed="rId15"/>
                     <a:stretch>
                       <a:fillRect/>
                     </a:stretch>
@@ -786,7 +865,7 @@
         <w:drawing>
           <wp:inline xmlns:a="http://schemas.openxmlformats.org/drawingml/2006/main" xmlns:pic="http://schemas.openxmlformats.org/drawingml/2006/picture">
             <wp:extent cx="5760720" cy="3600450"/>
-            <wp:docPr id="7" name="Picture 7"/>
+            <wp:docPr id="8" name="Picture 8"/>
             <wp:cNvGraphicFramePr>
               <a:graphicFrameLocks noChangeAspect="1"/>
             </wp:cNvGraphicFramePr>
@@ -798,7 +877,7 @@
                     <pic:cNvPicPr/>
                   </pic:nvPicPr>
                   <pic:blipFill>
-                    <a:blip r:embed="rId15"/>
+                    <a:blip r:embed="rId16"/>
                     <a:stretch>
                       <a:fillRect/>
                     </a:stretch>
@@ -881,7 +960,7 @@
         <w:drawing>
           <wp:inline xmlns:a="http://schemas.openxmlformats.org/drawingml/2006/main" xmlns:pic="http://schemas.openxmlformats.org/drawingml/2006/picture">
             <wp:extent cx="5760720" cy="3600450"/>
-            <wp:docPr id="8" name="Picture 8"/>
+            <wp:docPr id="9" name="Picture 9"/>
             <wp:cNvGraphicFramePr>
               <a:graphicFrameLocks noChangeAspect="1"/>
             </wp:cNvGraphicFramePr>
@@ -893,7 +972,7 @@
                     <pic:cNvPicPr/>
                   </pic:nvPicPr>
                   <pic:blipFill>
-                    <a:blip r:embed="rId16"/>
+                    <a:blip r:embed="rId17"/>
                     <a:stretch>
                       <a:fillRect/>
                     </a:stretch>
@@ -984,7 +1063,7 @@
         <w:drawing>
           <wp:inline xmlns:a="http://schemas.openxmlformats.org/drawingml/2006/main" xmlns:pic="http://schemas.openxmlformats.org/drawingml/2006/picture">
             <wp:extent cx="5760720" cy="3600450"/>
-            <wp:docPr id="9" name="Picture 9"/>
+            <wp:docPr id="10" name="Picture 10"/>
             <wp:cNvGraphicFramePr>
               <a:graphicFrameLocks noChangeAspect="1"/>
             </wp:cNvGraphicFramePr>
@@ -996,7 +1075,7 @@
                     <pic:cNvPicPr/>
                   </pic:nvPicPr>
                   <pic:blipFill>
-                    <a:blip r:embed="rId17"/>
+                    <a:blip r:embed="rId18"/>
                     <a:stretch>
                       <a:fillRect/>
                     </a:stretch>

</xml_diff>